<commit_message>
Release 1.0.4 — updated templates and app changes
</commit_message>
<xml_diff>
--- a/templates/Daily Log Template.docx
+++ b/templates/Daily Log Template.docx
@@ -1239,117 +1239,123 @@
                 <w:sz w:val="18"/>
                 <w:szCs w:val="18"/>
               </w:rPr>
-              <w:t>{#</w:t>
-            </w:r>
-            <w:proofErr w:type="gramStart"/>
+              <w:t>{#samples}</w:t>
+            </w:r>
             <w:r>
               <w:rPr>
                 <w:rFonts w:ascii="Arial" w:hAnsi="Arial" w:cs="Arial"/>
                 <w:sz w:val="18"/>
                 <w:szCs w:val="18"/>
               </w:rPr>
-              <w:t>samples}</w:t>
-            </w:r>
-            <w:r>
+              <w:t>{sampleNumber}</w:t>
+            </w:r>
+          </w:p>
+        </w:tc>
+        <w:tc>
+          <w:tcPr>
+            <w:tcW w:w="4770" w:type="dxa"/>
+            <w:vAlign w:val="center"/>
+          </w:tcPr>
+          <w:p>
+            <w:pPr>
+              <w:jc w:val="center"/>
               <w:rPr>
                 <w:rFonts w:ascii="Arial" w:hAnsi="Arial" w:cs="Arial"/>
                 <w:sz w:val="18"/>
                 <w:szCs w:val="18"/>
               </w:rPr>
-              <w:t>{</w:t>
-            </w:r>
-            <w:proofErr w:type="gramEnd"/>
+            </w:pPr>
             <w:r>
               <w:rPr>
                 <w:rFonts w:ascii="Arial" w:hAnsi="Arial" w:cs="Arial"/>
                 <w:sz w:val="18"/>
                 <w:szCs w:val="18"/>
               </w:rPr>
-              <w:t>sampleNumber}</w:t>
-            </w:r>
-          </w:p>
-        </w:tc>
-        <w:tc>
-          <w:tcPr>
-            <w:tcW w:w="4770" w:type="dxa"/>
-            <w:vAlign w:val="center"/>
-          </w:tcPr>
-          <w:p>
-            <w:pPr>
-              <w:jc w:val="center"/>
+              <w:t>{</w:t>
+            </w:r>
+            <w:proofErr w:type="spellStart"/>
+            <w:r>
               <w:rPr>
                 <w:rFonts w:ascii="Arial" w:hAnsi="Arial" w:cs="Arial"/>
                 <w:sz w:val="18"/>
                 <w:szCs w:val="18"/>
               </w:rPr>
-            </w:pPr>
+              <w:t>sampleDescription</w:t>
+            </w:r>
+            <w:proofErr w:type="spellEnd"/>
             <w:r>
               <w:rPr>
                 <w:rFonts w:ascii="Arial" w:hAnsi="Arial" w:cs="Arial"/>
                 <w:sz w:val="18"/>
                 <w:szCs w:val="18"/>
               </w:rPr>
-              <w:t>{</w:t>
-            </w:r>
-            <w:proofErr w:type="spellStart"/>
-            <w:r>
+              <w:t>}</w:t>
+            </w:r>
+          </w:p>
+        </w:tc>
+        <w:tc>
+          <w:tcPr>
+            <w:tcW w:w="1530" w:type="dxa"/>
+            <w:vAlign w:val="center"/>
+          </w:tcPr>
+          <w:p>
+            <w:pPr>
+              <w:jc w:val="center"/>
               <w:rPr>
                 <w:rFonts w:ascii="Arial" w:hAnsi="Arial" w:cs="Arial"/>
                 <w:sz w:val="18"/>
                 <w:szCs w:val="18"/>
               </w:rPr>
-              <w:t>sampleDescription</w:t>
-            </w:r>
-            <w:proofErr w:type="spellEnd"/>
+            </w:pPr>
             <w:r>
               <w:rPr>
                 <w:rFonts w:ascii="Arial" w:hAnsi="Arial" w:cs="Arial"/>
                 <w:sz w:val="18"/>
                 <w:szCs w:val="18"/>
               </w:rPr>
-              <w:t>}</w:t>
-            </w:r>
-          </w:p>
-        </w:tc>
-        <w:tc>
-          <w:tcPr>
-            <w:tcW w:w="1530" w:type="dxa"/>
-            <w:vAlign w:val="center"/>
-          </w:tcPr>
-          <w:p>
-            <w:pPr>
-              <w:jc w:val="center"/>
+              <w:t>{</w:t>
+            </w:r>
+            <w:proofErr w:type="spellStart"/>
+            <w:r>
               <w:rPr>
                 <w:rFonts w:ascii="Arial" w:hAnsi="Arial" w:cs="Arial"/>
                 <w:sz w:val="18"/>
                 <w:szCs w:val="18"/>
               </w:rPr>
-            </w:pPr>
+              <w:t>sampleType</w:t>
+            </w:r>
+            <w:proofErr w:type="spellEnd"/>
             <w:r>
               <w:rPr>
                 <w:rFonts w:ascii="Arial" w:hAnsi="Arial" w:cs="Arial"/>
                 <w:sz w:val="18"/>
                 <w:szCs w:val="18"/>
               </w:rPr>
-              <w:t>{</w:t>
-            </w:r>
-            <w:proofErr w:type="spellStart"/>
-            <w:r>
+              <w:t>}</w:t>
+            </w:r>
+          </w:p>
+        </w:tc>
+        <w:tc>
+          <w:tcPr>
+            <w:tcW w:w="1170" w:type="dxa"/>
+            <w:vAlign w:val="center"/>
+          </w:tcPr>
+          <w:p>
+            <w:pPr>
+              <w:jc w:val="center"/>
               <w:rPr>
                 <w:rFonts w:ascii="Arial" w:hAnsi="Arial" w:cs="Arial"/>
                 <w:sz w:val="18"/>
                 <w:szCs w:val="18"/>
               </w:rPr>
-              <w:t>sampleType</w:t>
-            </w:r>
-            <w:proofErr w:type="spellEnd"/>
+            </w:pPr>
             <w:r>
               <w:rPr>
                 <w:rFonts w:ascii="Arial" w:hAnsi="Arial" w:cs="Arial"/>
                 <w:sz w:val="18"/>
                 <w:szCs w:val="18"/>
               </w:rPr>
-              <w:t>}</w:t>
+              <w:t>{start}</w:t>
             </w:r>
           </w:p>
         </w:tc>
@@ -1373,49 +1379,15 @@
                 <w:sz w:val="18"/>
                 <w:szCs w:val="18"/>
               </w:rPr>
-              <w:t>{start}</w:t>
-            </w:r>
-          </w:p>
-        </w:tc>
-        <w:tc>
-          <w:tcPr>
-            <w:tcW w:w="1170" w:type="dxa"/>
-            <w:vAlign w:val="center"/>
-          </w:tcPr>
-          <w:p>
-            <w:pPr>
-              <w:jc w:val="center"/>
+              <w:t>{stop}</w:t>
+            </w:r>
+            <w:r>
               <w:rPr>
                 <w:rFonts w:ascii="Arial" w:hAnsi="Arial" w:cs="Arial"/>
                 <w:sz w:val="18"/>
                 <w:szCs w:val="18"/>
               </w:rPr>
-            </w:pPr>
-            <w:proofErr w:type="gramStart"/>
-            <w:r>
-              <w:rPr>
-                <w:rFonts w:ascii="Arial" w:hAnsi="Arial" w:cs="Arial"/>
-                <w:sz w:val="18"/>
-                <w:szCs w:val="18"/>
-              </w:rPr>
-              <w:t>{stop}</w:t>
-            </w:r>
-            <w:r>
-              <w:rPr>
-                <w:rFonts w:ascii="Arial" w:hAnsi="Arial" w:cs="Arial"/>
-                <w:sz w:val="18"/>
-                <w:szCs w:val="18"/>
-              </w:rPr>
-              <w:t>{/</w:t>
-            </w:r>
-            <w:proofErr w:type="gramEnd"/>
-            <w:r>
-              <w:rPr>
-                <w:rFonts w:ascii="Arial" w:hAnsi="Arial" w:cs="Arial"/>
-                <w:sz w:val="18"/>
-                <w:szCs w:val="18"/>
-              </w:rPr>
-              <w:t>samples}</w:t>
+              <w:t>{/samples}</w:t>
             </w:r>
           </w:p>
         </w:tc>
@@ -1493,23 +1465,13 @@
                 <w:szCs w:val="20"/>
               </w:rPr>
             </w:pPr>
-            <w:proofErr w:type="gramStart"/>
-            <w:r>
-              <w:rPr>
-                <w:rFonts w:ascii="Arial" w:hAnsi="Arial" w:cs="Arial"/>
-                <w:sz w:val="20"/>
-                <w:szCs w:val="20"/>
-              </w:rPr>
-              <w:t>Detail</w:t>
-            </w:r>
-            <w:proofErr w:type="gramEnd"/>
-            <w:r>
-              <w:rPr>
-                <w:rFonts w:ascii="Arial" w:hAnsi="Arial" w:cs="Arial"/>
-                <w:sz w:val="20"/>
-                <w:szCs w:val="20"/>
-              </w:rPr>
-              <w:t xml:space="preserve"> of Work</w:t>
+            <w:r>
+              <w:rPr>
+                <w:rFonts w:ascii="Arial" w:hAnsi="Arial" w:cs="Arial"/>
+                <w:sz w:val="20"/>
+                <w:szCs w:val="20"/>
+              </w:rPr>
+              <w:t>Detail of Work</w:t>
             </w:r>
           </w:p>
         </w:tc>
@@ -1572,7 +1534,6 @@
               </w:rPr>
               <w:t>{#</w:t>
             </w:r>
-            <w:proofErr w:type="gramStart"/>
             <w:r>
               <w:rPr>
                 <w:rFonts w:ascii="Arial" w:hAnsi="Arial" w:cs="Arial"/>
@@ -1595,16 +1556,7 @@
                 <w:sz w:val="20"/>
                 <w:szCs w:val="20"/>
               </w:rPr>
-              <w:t>ntries}{</w:t>
-            </w:r>
-            <w:proofErr w:type="gramEnd"/>
-            <w:r>
-              <w:rPr>
-                <w:rFonts w:ascii="Arial" w:hAnsi="Arial" w:cs="Arial"/>
-                <w:sz w:val="20"/>
-                <w:szCs w:val="20"/>
-              </w:rPr>
-              <w:t>time}</w:t>
+              <w:t>ntries}{time}</w:t>
             </w:r>
           </w:p>
         </w:tc>
@@ -1633,6 +1585,23 @@
                 <w:sz w:val="20"/>
                 <w:szCs w:val="20"/>
               </w:rPr>
+              <w:t>{description}</w:t>
+            </w:r>
+          </w:p>
+          <w:p>
+            <w:pPr>
+              <w:rPr>
+                <w:rFonts w:ascii="Arial" w:hAnsi="Arial" w:cs="Arial"/>
+                <w:sz w:val="20"/>
+                <w:szCs w:val="20"/>
+              </w:rPr>
+            </w:pPr>
+            <w:r>
+              <w:rPr>
+                <w:rFonts w:ascii="Arial" w:hAnsi="Arial" w:cs="Arial"/>
+                <w:sz w:val="20"/>
+                <w:szCs w:val="20"/>
+              </w:rPr>
               <w:t>{</w:t>
             </w:r>
             <w:proofErr w:type="spellStart"/>
@@ -1659,7 +1628,7 @@
                 <w:sz w:val="20"/>
                 <w:szCs w:val="20"/>
               </w:rPr>
-              <w:t>{description}{/</w:t>
+              <w:t>{/</w:t>
             </w:r>
             <w:proofErr w:type="spellStart"/>
             <w:r>
@@ -1896,43 +1865,7 @@
                 <w:szCs w:val="20"/>
               </w:rPr>
               <w:lastRenderedPageBreak/>
-              <w:t>{#</w:t>
-            </w:r>
-            <w:proofErr w:type="gramStart"/>
-            <w:r>
-              <w:rPr>
-                <w:rFonts w:ascii="Arial" w:hAnsi="Arial" w:cs="Arial"/>
-                <w:sz w:val="20"/>
-                <w:szCs w:val="20"/>
-              </w:rPr>
-              <w:t>photoLogRows}{</w:t>
-            </w:r>
-            <w:proofErr w:type="gramEnd"/>
-            <w:r>
-              <w:rPr>
-                <w:rFonts w:ascii="Arial" w:hAnsi="Arial" w:cs="Arial"/>
-                <w:sz w:val="20"/>
-                <w:szCs w:val="20"/>
-              </w:rPr>
-              <w:t>#col</w:t>
-            </w:r>
-            <w:proofErr w:type="gramStart"/>
-            <w:r>
-              <w:rPr>
-                <w:rFonts w:ascii="Arial" w:hAnsi="Arial" w:cs="Arial"/>
-                <w:sz w:val="20"/>
-                <w:szCs w:val="20"/>
-              </w:rPr>
-              <w:t>1}Photo</w:t>
-            </w:r>
-            <w:proofErr w:type="gramEnd"/>
-            <w:r>
-              <w:rPr>
-                <w:rFonts w:ascii="Arial" w:hAnsi="Arial" w:cs="Arial"/>
-                <w:sz w:val="20"/>
-                <w:szCs w:val="20"/>
-              </w:rPr>
-              <w:t xml:space="preserve"> #{number}{/col1}</w:t>
+              <w:t>{#photoLogRows}{#col1}Photo #{number}{/col1}</w:t>
             </w:r>
           </w:p>
         </w:tc>
@@ -1960,25 +1893,7 @@
                 <w:sz w:val="20"/>
                 <w:szCs w:val="20"/>
               </w:rPr>
-              <w:t>{#col</w:t>
-            </w:r>
-            <w:proofErr w:type="gramStart"/>
-            <w:r>
-              <w:rPr>
-                <w:rFonts w:ascii="Arial" w:hAnsi="Arial" w:cs="Arial"/>
-                <w:sz w:val="20"/>
-                <w:szCs w:val="20"/>
-              </w:rPr>
-              <w:t>2}Photo</w:t>
-            </w:r>
-            <w:proofErr w:type="gramEnd"/>
-            <w:r>
-              <w:rPr>
-                <w:rFonts w:ascii="Arial" w:hAnsi="Arial" w:cs="Arial"/>
-                <w:sz w:val="20"/>
-                <w:szCs w:val="20"/>
-              </w:rPr>
-              <w:t xml:space="preserve"> #{number}{/col2}</w:t>
+              <w:t>{#col2}Photo #{number}{/col2}</w:t>
             </w:r>
           </w:p>
         </w:tc>

</xml_diff>

<commit_message>
Release 1.0.24 — phone import overhaul, COC/roster formatting, dialog focus fix
- Lead Wipe COC placeholders now render (zip path normalization fix)
- Phone import: edited/original dedupe, copy retries, live progress bar,
  inactivity-based timeout, pipelined HEIC conversion, photo caching
- Fixed HEIC-named-.JPG conversion deleting its own output (lost photos)
- Worker Roster and COC placeholder repair preserves template formatting
- Native alert/confirm replaced with dialog.showMessageBoxSync (fixes
  unclickable inputs after dialogs)
- Photo quality 100 -> 85-90 for faster import/conversion
- Recent activity timeline uses daily log entry date+time
- Import grid shows photo time under each tile

Co-Authored-By: Claude Fable 5 <noreply@anthropic.com>
</commit_message>
<xml_diff>
--- a/templates/Daily Log Template.docx
+++ b/templates/Daily Log Template.docx
@@ -1216,9 +1216,6 @@
         </w:tc>
       </w:tr>
       <w:tr>
-        <w:trPr>
-          <w:trHeight w:hRule="exact" w:val="360"/>
-        </w:trPr>
         <w:tc>
           <w:tcPr>
             <w:tcW w:w="1890" w:type="dxa"/>
@@ -1239,15 +1236,33 @@
                 <w:sz w:val="18"/>
                 <w:szCs w:val="18"/>
               </w:rPr>
-              <w:t>{#samples}</w:t>
-            </w:r>
+              <w:t>{#</w:t>
+            </w:r>
+            <w:proofErr w:type="gramStart"/>
             <w:r>
               <w:rPr>
                 <w:rFonts w:ascii="Arial" w:hAnsi="Arial" w:cs="Arial"/>
                 <w:sz w:val="18"/>
                 <w:szCs w:val="18"/>
               </w:rPr>
-              <w:t>{sampleNumber}</w:t>
+              <w:t>samples}</w:t>
+            </w:r>
+            <w:r>
+              <w:rPr>
+                <w:rFonts w:ascii="Arial" w:hAnsi="Arial" w:cs="Arial"/>
+                <w:sz w:val="18"/>
+                <w:szCs w:val="18"/>
+              </w:rPr>
+              <w:t>{</w:t>
+            </w:r>
+            <w:proofErr w:type="gramEnd"/>
+            <w:r>
+              <w:rPr>
+                <w:rFonts w:ascii="Arial" w:hAnsi="Arial" w:cs="Arial"/>
+                <w:sz w:val="18"/>
+                <w:szCs w:val="18"/>
+              </w:rPr>
+              <w:t>sampleNumber}</w:t>
             </w:r>
           </w:p>
         </w:tc>
@@ -1373,6 +1388,7 @@
                 <w:szCs w:val="18"/>
               </w:rPr>
             </w:pPr>
+            <w:proofErr w:type="gramStart"/>
             <w:r>
               <w:rPr>
                 <w:rFonts w:ascii="Arial" w:hAnsi="Arial" w:cs="Arial"/>
@@ -1387,7 +1403,16 @@
                 <w:sz w:val="18"/>
                 <w:szCs w:val="18"/>
               </w:rPr>
-              <w:t>{/samples}</w:t>
+              <w:t>{/</w:t>
+            </w:r>
+            <w:proofErr w:type="gramEnd"/>
+            <w:r>
+              <w:rPr>
+                <w:rFonts w:ascii="Arial" w:hAnsi="Arial" w:cs="Arial"/>
+                <w:sz w:val="18"/>
+                <w:szCs w:val="18"/>
+              </w:rPr>
+              <w:t>samples}</w:t>
             </w:r>
           </w:p>
         </w:tc>
@@ -1844,8 +1869,9 @@
           <w:tcPr>
             <w:tcW w:w="5040" w:type="dxa"/>
             <w:tcBorders>
-              <w:left w:val="nil"/>
-              <w:right w:val="nil"/>
+              <w:left w:val="single" w:sz="4" w:space="0" w:color="auto"/>
+              <w:bottom w:val="single" w:sz="4" w:space="0" w:color="auto"/>
+              <w:right w:val="single" w:sz="4" w:space="0" w:color="auto"/>
             </w:tcBorders>
             <w:shd w:val="clear" w:color="auto" w:fill="EEECE1" w:themeFill="background2"/>
           </w:tcPr>
@@ -1873,8 +1899,9 @@
           <w:tcPr>
             <w:tcW w:w="5040" w:type="dxa"/>
             <w:tcBorders>
-              <w:left w:val="nil"/>
-              <w:right w:val="nil"/>
+              <w:left w:val="single" w:sz="4" w:space="0" w:color="auto"/>
+              <w:bottom w:val="single" w:sz="4" w:space="0" w:color="auto"/>
+              <w:right w:val="single" w:sz="4" w:space="0" w:color="auto"/>
             </w:tcBorders>
             <w:shd w:val="clear" w:color="auto" w:fill="EEECE1" w:themeFill="background2"/>
           </w:tcPr>
@@ -1901,15 +1928,15 @@
       <w:tr>
         <w:trPr>
           <w:cantSplit/>
-          <w:trHeight w:hRule="exact" w:val="5040"/>
+          <w:trHeight w:hRule="exact" w:val="3727"/>
         </w:trPr>
         <w:tc>
           <w:tcPr>
             <w:tcW w:w="5040" w:type="dxa"/>
             <w:tcBorders>
-              <w:left w:val="nil"/>
+              <w:left w:val="single" w:sz="4" w:space="0" w:color="auto"/>
               <w:bottom w:val="nil"/>
-              <w:right w:val="nil"/>
+              <w:right w:val="single" w:sz="4" w:space="0" w:color="auto"/>
             </w:tcBorders>
             <w:vAlign w:val="center"/>
           </w:tcPr>
@@ -1922,6 +1949,26 @@
                 <w:szCs w:val="20"/>
               </w:rPr>
             </w:pPr>
+          </w:p>
+          <w:p>
+            <w:pPr>
+              <w:jc w:val="center"/>
+              <w:rPr>
+                <w:rFonts w:ascii="Arial" w:hAnsi="Arial" w:cs="Arial"/>
+                <w:sz w:val="20"/>
+                <w:szCs w:val="20"/>
+              </w:rPr>
+            </w:pPr>
+          </w:p>
+          <w:p>
+            <w:pPr>
+              <w:jc w:val="center"/>
+              <w:rPr>
+                <w:rFonts w:ascii="Arial" w:hAnsi="Arial" w:cs="Arial"/>
+                <w:sz w:val="20"/>
+                <w:szCs w:val="20"/>
+              </w:rPr>
+            </w:pPr>
             <w:r>
               <w:rPr>
                 <w:rFonts w:ascii="Arial" w:hAnsi="Arial" w:cs="Arial"/>
@@ -1940,6 +1987,14 @@
                 <w:szCs w:val="20"/>
               </w:rPr>
             </w:pPr>
+            <w:r>
+              <w:rPr>
+                <w:rFonts w:ascii="Arial" w:hAnsi="Arial" w:cs="Arial"/>
+                <w:sz w:val="20"/>
+                <w:szCs w:val="20"/>
+              </w:rPr>
+              <w:t>{%%photo}</w:t>
+            </w:r>
           </w:p>
           <w:p>
             <w:pPr>
@@ -1956,7 +2011,7 @@
                 <w:sz w:val="20"/>
                 <w:szCs w:val="20"/>
               </w:rPr>
-              <w:t>{%%photo}</w:t>
+              <w:t>{/col1}</w:t>
             </w:r>
           </w:p>
           <w:p>
@@ -1968,24 +2023,6 @@
                 <w:szCs w:val="20"/>
               </w:rPr>
             </w:pPr>
-          </w:p>
-          <w:p>
-            <w:pPr>
-              <w:jc w:val="center"/>
-              <w:rPr>
-                <w:rFonts w:ascii="Arial" w:hAnsi="Arial" w:cs="Arial"/>
-                <w:sz w:val="20"/>
-                <w:szCs w:val="20"/>
-              </w:rPr>
-            </w:pPr>
-            <w:r>
-              <w:rPr>
-                <w:rFonts w:ascii="Arial" w:hAnsi="Arial" w:cs="Arial"/>
-                <w:sz w:val="20"/>
-                <w:szCs w:val="20"/>
-              </w:rPr>
-              <w:t>{/col1}</w:t>
-            </w:r>
           </w:p>
           <w:p>
             <w:pPr>
@@ -2002,9 +2039,9 @@
           <w:tcPr>
             <w:tcW w:w="5040" w:type="dxa"/>
             <w:tcBorders>
-              <w:left w:val="nil"/>
+              <w:left w:val="single" w:sz="4" w:space="0" w:color="auto"/>
               <w:bottom w:val="nil"/>
-              <w:right w:val="nil"/>
+              <w:right w:val="single" w:sz="4" w:space="0" w:color="auto"/>
             </w:tcBorders>
             <w:vAlign w:val="center"/>
           </w:tcPr>
@@ -2035,16 +2072,6 @@
                 <w:szCs w:val="20"/>
               </w:rPr>
             </w:pPr>
-          </w:p>
-          <w:p>
-            <w:pPr>
-              <w:jc w:val="center"/>
-              <w:rPr>
-                <w:rFonts w:ascii="Arial" w:hAnsi="Arial" w:cs="Arial"/>
-                <w:sz w:val="20"/>
-                <w:szCs w:val="20"/>
-              </w:rPr>
-            </w:pPr>
             <w:r>
               <w:rPr>
                 <w:rFonts w:ascii="Arial" w:hAnsi="Arial" w:cs="Arial"/>
@@ -2053,16 +2080,6 @@
               </w:rPr>
               <w:t>{%%photo}</w:t>
             </w:r>
-          </w:p>
-          <w:p>
-            <w:pPr>
-              <w:jc w:val="center"/>
-              <w:rPr>
-                <w:rFonts w:ascii="Arial" w:hAnsi="Arial" w:cs="Arial"/>
-                <w:sz w:val="20"/>
-                <w:szCs w:val="20"/>
-              </w:rPr>
-            </w:pPr>
           </w:p>
           <w:p>
             <w:pPr>

</xml_diff>

<commit_message>
Fix daily log Word output repeating entries and pressure text
Move {negativePressure} outside the logEntries loop and keep
{photoNumber} inside it in the Daily Log template. Also harden
placeholder repair for Word-split {#...} tags like logEntries/samples.

Co-authored-by: fernandoqv1 <fernandoqv1@users.noreply.github.com>
</commit_message>
<xml_diff>
--- a/templates/Daily Log Template.docx
+++ b/templates/Daily Log Template.docx
@@ -132,25 +132,7 @@
                 <w:sz w:val="20"/>
                 <w:szCs w:val="20"/>
               </w:rPr>
-              <w:t>{</w:t>
-            </w:r>
-            <w:proofErr w:type="spellStart"/>
-            <w:r>
-              <w:rPr>
-                <w:rFonts w:ascii="Arial" w:hAnsi="Arial" w:cs="Arial"/>
-                <w:sz w:val="20"/>
-                <w:szCs w:val="20"/>
-              </w:rPr>
-              <w:t>projectNumber</w:t>
-            </w:r>
-            <w:proofErr w:type="spellEnd"/>
-            <w:r>
-              <w:rPr>
-                <w:rFonts w:ascii="Arial" w:hAnsi="Arial" w:cs="Arial"/>
-                <w:sz w:val="20"/>
-                <w:szCs w:val="20"/>
-              </w:rPr>
-              <w:t>}</w:t>
+              <w:t>{projectNumber}</w:t>
             </w:r>
           </w:p>
         </w:tc>
@@ -211,25 +193,7 @@
                 <w:sz w:val="20"/>
                 <w:szCs w:val="20"/>
               </w:rPr>
-              <w:t>{</w:t>
-            </w:r>
-            <w:proofErr w:type="spellStart"/>
-            <w:r>
-              <w:rPr>
-                <w:rFonts w:ascii="Arial" w:hAnsi="Arial" w:cs="Arial"/>
-                <w:sz w:val="20"/>
-                <w:szCs w:val="20"/>
-              </w:rPr>
-              <w:t>inspectorInitials</w:t>
-            </w:r>
-            <w:proofErr w:type="spellEnd"/>
-            <w:r>
-              <w:rPr>
-                <w:rFonts w:ascii="Arial" w:hAnsi="Arial" w:cs="Arial"/>
-                <w:sz w:val="20"/>
-                <w:szCs w:val="20"/>
-              </w:rPr>
-              <w:t>}</w:t>
+              <w:t>{inspectorInitials}</w:t>
             </w:r>
           </w:p>
         </w:tc>
@@ -428,25 +392,7 @@
                 <w:sz w:val="20"/>
                 <w:szCs w:val="20"/>
               </w:rPr>
-              <w:t>{</w:t>
-            </w:r>
-            <w:proofErr w:type="spellStart"/>
-            <w:r>
-              <w:rPr>
-                <w:rFonts w:ascii="Arial" w:hAnsi="Arial" w:cs="Arial"/>
-                <w:sz w:val="20"/>
-                <w:szCs w:val="20"/>
-              </w:rPr>
-              <w:t>clientPhone</w:t>
-            </w:r>
-            <w:proofErr w:type="spellEnd"/>
-            <w:r>
-              <w:rPr>
-                <w:rFonts w:ascii="Arial" w:hAnsi="Arial" w:cs="Arial"/>
-                <w:sz w:val="20"/>
-                <w:szCs w:val="20"/>
-              </w:rPr>
-              <w:t>}</w:t>
+              <w:t>{clientPhone}</w:t>
             </w:r>
           </w:p>
         </w:tc>
@@ -500,25 +446,7 @@
                 <w:sz w:val="20"/>
                 <w:szCs w:val="20"/>
               </w:rPr>
-              <w:t>{</w:t>
-            </w:r>
-            <w:proofErr w:type="spellStart"/>
-            <w:r>
-              <w:rPr>
-                <w:rFonts w:ascii="Arial" w:hAnsi="Arial" w:cs="Arial"/>
-                <w:sz w:val="20"/>
-                <w:szCs w:val="20"/>
-              </w:rPr>
-              <w:t>clientFax</w:t>
-            </w:r>
-            <w:proofErr w:type="spellEnd"/>
-            <w:r>
-              <w:rPr>
-                <w:rFonts w:ascii="Arial" w:hAnsi="Arial" w:cs="Arial"/>
-                <w:sz w:val="20"/>
-                <w:szCs w:val="20"/>
-              </w:rPr>
-              <w:t>}</w:t>
+              <w:t>{clientFax}</w:t>
             </w:r>
           </w:p>
         </w:tc>
@@ -579,25 +507,7 @@
                 <w:sz w:val="20"/>
                 <w:szCs w:val="20"/>
               </w:rPr>
-              <w:t>{</w:t>
-            </w:r>
-            <w:proofErr w:type="spellStart"/>
-            <w:r>
-              <w:rPr>
-                <w:rFonts w:ascii="Arial" w:hAnsi="Arial" w:cs="Arial"/>
-                <w:sz w:val="20"/>
-                <w:szCs w:val="20"/>
-              </w:rPr>
-              <w:t>projectSite</w:t>
-            </w:r>
-            <w:proofErr w:type="spellEnd"/>
-            <w:r>
-              <w:rPr>
-                <w:rFonts w:ascii="Arial" w:hAnsi="Arial" w:cs="Arial"/>
-                <w:sz w:val="20"/>
-                <w:szCs w:val="20"/>
-              </w:rPr>
-              <w:t>}</w:t>
+              <w:t>{projectSite}</w:t>
             </w:r>
           </w:p>
         </w:tc>
@@ -652,25 +562,7 @@
                 <w:sz w:val="20"/>
                 <w:szCs w:val="20"/>
               </w:rPr>
-              <w:t>{</w:t>
-            </w:r>
-            <w:proofErr w:type="spellStart"/>
-            <w:r>
-              <w:rPr>
-                <w:rFonts w:ascii="Arial" w:hAnsi="Arial" w:cs="Arial"/>
-                <w:sz w:val="20"/>
-                <w:szCs w:val="20"/>
-              </w:rPr>
-              <w:t>workLocation</w:t>
-            </w:r>
-            <w:proofErr w:type="spellEnd"/>
-            <w:r>
-              <w:rPr>
-                <w:rFonts w:ascii="Arial" w:hAnsi="Arial" w:cs="Arial"/>
-                <w:sz w:val="20"/>
-                <w:szCs w:val="20"/>
-              </w:rPr>
-              <w:t>}</w:t>
+              <w:t>{workLocation}</w:t>
             </w:r>
           </w:p>
         </w:tc>
@@ -816,25 +708,7 @@
                 <w:sz w:val="20"/>
                 <w:szCs w:val="20"/>
               </w:rPr>
-              <w:t>{</w:t>
-            </w:r>
-            <w:proofErr w:type="spellStart"/>
-            <w:r>
-              <w:rPr>
-                <w:rFonts w:ascii="Arial" w:hAnsi="Arial" w:cs="Arial"/>
-                <w:sz w:val="20"/>
-                <w:szCs w:val="20"/>
-              </w:rPr>
-              <w:t>personnelCount</w:t>
-            </w:r>
-            <w:proofErr w:type="spellEnd"/>
-            <w:r>
-              <w:rPr>
-                <w:rFonts w:ascii="Arial" w:hAnsi="Arial" w:cs="Arial"/>
-                <w:sz w:val="20"/>
-                <w:szCs w:val="20"/>
-              </w:rPr>
-              <w:t>}</w:t>
+              <w:t>{personnelCount}</w:t>
             </w:r>
           </w:p>
         </w:tc>
@@ -895,25 +769,7 @@
                 <w:sz w:val="20"/>
                 <w:szCs w:val="20"/>
               </w:rPr>
-              <w:t>{</w:t>
-            </w:r>
-            <w:proofErr w:type="spellStart"/>
-            <w:r>
-              <w:rPr>
-                <w:rFonts w:ascii="Arial" w:hAnsi="Arial" w:cs="Arial"/>
-                <w:sz w:val="20"/>
-                <w:szCs w:val="20"/>
-              </w:rPr>
-              <w:t>contractorPhone</w:t>
-            </w:r>
-            <w:proofErr w:type="spellEnd"/>
-            <w:r>
-              <w:rPr>
-                <w:rFonts w:ascii="Arial" w:hAnsi="Arial" w:cs="Arial"/>
-                <w:sz w:val="20"/>
-                <w:szCs w:val="20"/>
-              </w:rPr>
-              <w:t>}</w:t>
+              <w:t>{contractorPhone}</w:t>
             </w:r>
           </w:p>
         </w:tc>
@@ -967,25 +823,7 @@
                 <w:sz w:val="20"/>
                 <w:szCs w:val="20"/>
               </w:rPr>
-              <w:t>{</w:t>
-            </w:r>
-            <w:proofErr w:type="spellStart"/>
-            <w:r>
-              <w:rPr>
-                <w:rFonts w:ascii="Arial" w:hAnsi="Arial" w:cs="Arial"/>
-                <w:sz w:val="20"/>
-                <w:szCs w:val="20"/>
-              </w:rPr>
-              <w:t>contractorFax</w:t>
-            </w:r>
-            <w:proofErr w:type="spellEnd"/>
-            <w:r>
-              <w:rPr>
-                <w:rFonts w:ascii="Arial" w:hAnsi="Arial" w:cs="Arial"/>
-                <w:sz w:val="20"/>
-                <w:szCs w:val="20"/>
-              </w:rPr>
-              <w:t>}</w:t>
+              <w:t>{contractorFax}</w:t>
             </w:r>
           </w:p>
         </w:tc>
@@ -1286,67 +1124,31 @@
                 <w:sz w:val="18"/>
                 <w:szCs w:val="18"/>
               </w:rPr>
-              <w:t>{</w:t>
-            </w:r>
-            <w:proofErr w:type="spellStart"/>
-            <w:r>
+              <w:t>{sampleDescription}</w:t>
+            </w:r>
+          </w:p>
+        </w:tc>
+        <w:tc>
+          <w:tcPr>
+            <w:tcW w:w="1530" w:type="dxa"/>
+            <w:vAlign w:val="center"/>
+          </w:tcPr>
+          <w:p>
+            <w:pPr>
+              <w:jc w:val="center"/>
               <w:rPr>
                 <w:rFonts w:ascii="Arial" w:hAnsi="Arial" w:cs="Arial"/>
                 <w:sz w:val="18"/>
                 <w:szCs w:val="18"/>
               </w:rPr>
-              <w:t>sampleDescription</w:t>
-            </w:r>
-            <w:proofErr w:type="spellEnd"/>
+            </w:pPr>
             <w:r>
               <w:rPr>
                 <w:rFonts w:ascii="Arial" w:hAnsi="Arial" w:cs="Arial"/>
                 <w:sz w:val="18"/>
                 <w:szCs w:val="18"/>
               </w:rPr>
-              <w:t>}</w:t>
-            </w:r>
-          </w:p>
-        </w:tc>
-        <w:tc>
-          <w:tcPr>
-            <w:tcW w:w="1530" w:type="dxa"/>
-            <w:vAlign w:val="center"/>
-          </w:tcPr>
-          <w:p>
-            <w:pPr>
-              <w:jc w:val="center"/>
-              <w:rPr>
-                <w:rFonts w:ascii="Arial" w:hAnsi="Arial" w:cs="Arial"/>
-                <w:sz w:val="18"/>
-                <w:szCs w:val="18"/>
-              </w:rPr>
-            </w:pPr>
-            <w:r>
-              <w:rPr>
-                <w:rFonts w:ascii="Arial" w:hAnsi="Arial" w:cs="Arial"/>
-                <w:sz w:val="18"/>
-                <w:szCs w:val="18"/>
-              </w:rPr>
-              <w:t>{</w:t>
-            </w:r>
-            <w:proofErr w:type="spellStart"/>
-            <w:r>
-              <w:rPr>
-                <w:rFonts w:ascii="Arial" w:hAnsi="Arial" w:cs="Arial"/>
-                <w:sz w:val="18"/>
-                <w:szCs w:val="18"/>
-              </w:rPr>
-              <w:t>sampleType</w:t>
-            </w:r>
-            <w:proofErr w:type="spellEnd"/>
-            <w:r>
-              <w:rPr>
-                <w:rFonts w:ascii="Arial" w:hAnsi="Arial" w:cs="Arial"/>
-                <w:sz w:val="18"/>
-                <w:szCs w:val="18"/>
-              </w:rPr>
-              <w:t>}</w:t>
+              <w:t>{sampleType}</w:t>
             </w:r>
           </w:p>
         </w:tc>
@@ -1557,31 +1359,7 @@
                 <w:sz w:val="20"/>
                 <w:szCs w:val="20"/>
               </w:rPr>
-              <w:t>{#</w:t>
-            </w:r>
-            <w:r>
-              <w:rPr>
-                <w:rFonts w:ascii="Arial" w:hAnsi="Arial" w:cs="Arial"/>
-                <w:sz w:val="20"/>
-                <w:szCs w:val="20"/>
-              </w:rPr>
-              <w:t>log</w:t>
-            </w:r>
-            <w:r>
-              <w:rPr>
-                <w:rFonts w:ascii="Arial" w:hAnsi="Arial" w:cs="Arial"/>
-                <w:sz w:val="20"/>
-                <w:szCs w:val="20"/>
-              </w:rPr>
-              <w:t>E</w:t>
-            </w:r>
-            <w:r>
-              <w:rPr>
-                <w:rFonts w:ascii="Arial" w:hAnsi="Arial" w:cs="Arial"/>
-                <w:sz w:val="20"/>
-                <w:szCs w:val="20"/>
-              </w:rPr>
-              <w:t>ntries}{time}</w:t>
+              <w:t>{#logEntries}{time}</w:t>
             </w:r>
           </w:p>
         </w:tc>
@@ -1613,67 +1391,6 @@
               <w:t>{description}</w:t>
             </w:r>
           </w:p>
-          <w:p>
-            <w:pPr>
-              <w:rPr>
-                <w:rFonts w:ascii="Arial" w:hAnsi="Arial" w:cs="Arial"/>
-                <w:sz w:val="20"/>
-                <w:szCs w:val="20"/>
-              </w:rPr>
-            </w:pPr>
-            <w:r>
-              <w:rPr>
-                <w:rFonts w:ascii="Arial" w:hAnsi="Arial" w:cs="Arial"/>
-                <w:sz w:val="20"/>
-                <w:szCs w:val="20"/>
-              </w:rPr>
-              <w:t>{</w:t>
-            </w:r>
-            <w:proofErr w:type="spellStart"/>
-            <w:r>
-              <w:rPr>
-                <w:rFonts w:ascii="Arial" w:hAnsi="Arial" w:cs="Arial"/>
-                <w:sz w:val="20"/>
-                <w:szCs w:val="20"/>
-              </w:rPr>
-              <w:t>negativePressure</w:t>
-            </w:r>
-            <w:proofErr w:type="spellEnd"/>
-            <w:r>
-              <w:rPr>
-                <w:rFonts w:ascii="Arial" w:hAnsi="Arial" w:cs="Arial"/>
-                <w:sz w:val="20"/>
-                <w:szCs w:val="20"/>
-              </w:rPr>
-              <w:t>}</w:t>
-            </w:r>
-            <w:r>
-              <w:rPr>
-                <w:rFonts w:ascii="Arial" w:hAnsi="Arial" w:cs="Arial"/>
-                <w:sz w:val="20"/>
-                <w:szCs w:val="20"/>
-              </w:rPr>
-              <w:t>{/</w:t>
-            </w:r>
-            <w:proofErr w:type="spellStart"/>
-            <w:r>
-              <w:rPr>
-                <w:rFonts w:ascii="Arial" w:hAnsi="Arial" w:cs="Arial"/>
-                <w:sz w:val="20"/>
-                <w:szCs w:val="20"/>
-              </w:rPr>
-              <w:t>logEntries</w:t>
-            </w:r>
-            <w:proofErr w:type="spellEnd"/>
-            <w:r>
-              <w:rPr>
-                <w:rFonts w:ascii="Arial" w:hAnsi="Arial" w:cs="Arial"/>
-                <w:sz w:val="20"/>
-                <w:szCs w:val="20"/>
-              </w:rPr>
-              <w:t>}</w:t>
-            </w:r>
-          </w:p>
         </w:tc>
         <w:tc>
           <w:tcPr>
@@ -1700,30 +1417,37 @@
                 <w:sz w:val="20"/>
                 <w:szCs w:val="20"/>
               </w:rPr>
-              <w:t>{</w:t>
-            </w:r>
-            <w:proofErr w:type="spellStart"/>
-            <w:r>
-              <w:rPr>
-                <w:rFonts w:ascii="Arial" w:hAnsi="Arial" w:cs="Arial"/>
-                <w:sz w:val="20"/>
-                <w:szCs w:val="20"/>
-              </w:rPr>
-              <w:t>photoNumber</w:t>
-            </w:r>
-            <w:proofErr w:type="spellEnd"/>
-            <w:r>
-              <w:rPr>
-                <w:rFonts w:ascii="Arial" w:hAnsi="Arial" w:cs="Arial"/>
-                <w:sz w:val="20"/>
-                <w:szCs w:val="20"/>
-              </w:rPr>
-              <w:t>}</w:t>
+              <w:t>{photoNumber}</w:t>
+            </w:r>
+            <w:r>
+              <w:rPr>
+                <w:rFonts w:ascii="Arial" w:hAnsi="Arial" w:cs="Arial"/>
+                <w:sz w:val="20"/>
+                <w:szCs w:val="20"/>
+              </w:rPr>
+              <w:t>{/logEntries}</w:t>
             </w:r>
           </w:p>
         </w:tc>
       </w:tr>
     </w:tbl>
+    <w:p>
+      <w:pPr>
+        <w:rPr>
+          <w:rFonts w:ascii="Arial" w:hAnsi="Arial" w:cs="Arial"/>
+          <w:sz w:val="20"/>
+          <w:szCs w:val="20"/>
+        </w:rPr>
+      </w:pPr>
+      <w:r>
+        <w:rPr>
+          <w:rFonts w:ascii="Arial" w:hAnsi="Arial" w:cs="Arial"/>
+          <w:sz w:val="20"/>
+          <w:szCs w:val="20"/>
+        </w:rPr>
+        <w:t>{negativePressure}</w:t>
+      </w:r>
+    </w:p>
     <w:p>
       <w:pPr>
         <w:jc w:val="center"/>
@@ -1810,25 +1534,7 @@
                 <w:sz w:val="20"/>
                 <w:szCs w:val="20"/>
               </w:rPr>
-              <w:t>{</w:t>
-            </w:r>
-            <w:proofErr w:type="spellStart"/>
-            <w:r>
-              <w:rPr>
-                <w:rFonts w:ascii="Arial" w:hAnsi="Arial" w:cs="Arial"/>
-                <w:sz w:val="20"/>
-                <w:szCs w:val="20"/>
-              </w:rPr>
-              <w:t>inspectorName</w:t>
-            </w:r>
-            <w:proofErr w:type="spellEnd"/>
-            <w:r>
-              <w:rPr>
-                <w:rFonts w:ascii="Arial" w:hAnsi="Arial" w:cs="Arial"/>
-                <w:sz w:val="20"/>
-                <w:szCs w:val="20"/>
-              </w:rPr>
-              <w:t>}</w:t>
+              <w:t>{inspectorName}</w:t>
             </w:r>
           </w:p>
         </w:tc>
@@ -2096,82 +1802,7 @@
                 <w:sz w:val="20"/>
                 <w:szCs w:val="20"/>
               </w:rPr>
-              <w:t>{/col2}</w:t>
-            </w:r>
-          </w:p>
-        </w:tc>
-      </w:tr>
-      <w:tr>
-        <w:trPr>
-          <w:cantSplit/>
-          <w:trHeight w:val="125"/>
-        </w:trPr>
-        <w:tc>
-          <w:tcPr>
-            <w:tcW w:w="5040" w:type="dxa"/>
-            <w:tcBorders>
-              <w:top w:val="nil"/>
-              <w:left w:val="nil"/>
-              <w:bottom w:val="nil"/>
-              <w:right w:val="nil"/>
-            </w:tcBorders>
-            <w:vAlign w:val="center"/>
-          </w:tcPr>
-          <w:p>
-            <w:pPr>
-              <w:jc w:val="center"/>
-              <w:rPr>
-                <w:rFonts w:ascii="Arial" w:hAnsi="Arial" w:cs="Arial"/>
-                <w:sz w:val="20"/>
-                <w:szCs w:val="20"/>
-              </w:rPr>
-            </w:pPr>
-          </w:p>
-        </w:tc>
-        <w:tc>
-          <w:tcPr>
-            <w:tcW w:w="5040" w:type="dxa"/>
-            <w:tcBorders>
-              <w:top w:val="nil"/>
-              <w:left w:val="nil"/>
-              <w:bottom w:val="nil"/>
-              <w:right w:val="nil"/>
-            </w:tcBorders>
-          </w:tcPr>
-          <w:p>
-            <w:pPr>
-              <w:jc w:val="center"/>
-              <w:rPr>
-                <w:rFonts w:ascii="Arial" w:hAnsi="Arial" w:cs="Arial"/>
-                <w:sz w:val="20"/>
-                <w:szCs w:val="20"/>
-              </w:rPr>
-            </w:pPr>
-            <w:r>
-              <w:rPr>
-                <w:rFonts w:ascii="Arial" w:hAnsi="Arial" w:cs="Arial"/>
-                <w:sz w:val="20"/>
-                <w:szCs w:val="20"/>
-              </w:rPr>
-              <w:t>{/</w:t>
-            </w:r>
-            <w:proofErr w:type="spellStart"/>
-            <w:r>
-              <w:rPr>
-                <w:rFonts w:ascii="Arial" w:hAnsi="Arial" w:cs="Arial"/>
-                <w:sz w:val="20"/>
-                <w:szCs w:val="20"/>
-              </w:rPr>
-              <w:t>photoLogRows</w:t>
-            </w:r>
-            <w:proofErr w:type="spellEnd"/>
-            <w:r>
-              <w:rPr>
-                <w:rFonts w:ascii="Arial" w:hAnsi="Arial" w:cs="Arial"/>
-                <w:sz w:val="20"/>
-                <w:szCs w:val="20"/>
-              </w:rPr>
-              <w:t>}</w:t>
+              <w:t>{/col2}{/photoLogRows}</w:t>
             </w:r>
           </w:p>
         </w:tc>

</xml_diff>

<commit_message>
Release 1.0.33 — worker roster import and merged 1.0.31 features
Merge worker roster import (from another project or Excel), fit-test-only
validation, schema migration v2, and related fixes that were on the
catch-up branch but missing from the 1.0.32 build.
</commit_message>
<xml_diff>
--- a/templates/Daily Log Template.docx
+++ b/templates/Daily Log Template.docx
@@ -132,25 +132,7 @@
                 <w:sz w:val="20"/>
                 <w:szCs w:val="20"/>
               </w:rPr>
-              <w:t>{</w:t>
-            </w:r>
-            <w:proofErr w:type="spellStart"/>
-            <w:r>
-              <w:rPr>
-                <w:rFonts w:ascii="Arial" w:hAnsi="Arial" w:cs="Arial"/>
-                <w:sz w:val="20"/>
-                <w:szCs w:val="20"/>
-              </w:rPr>
-              <w:t>projectNumber</w:t>
-            </w:r>
-            <w:proofErr w:type="spellEnd"/>
-            <w:r>
-              <w:rPr>
-                <w:rFonts w:ascii="Arial" w:hAnsi="Arial" w:cs="Arial"/>
-                <w:sz w:val="20"/>
-                <w:szCs w:val="20"/>
-              </w:rPr>
-              <w:t>}</w:t>
+              <w:t>{projectNumber}</w:t>
             </w:r>
           </w:p>
         </w:tc>
@@ -211,25 +193,7 @@
                 <w:sz w:val="20"/>
                 <w:szCs w:val="20"/>
               </w:rPr>
-              <w:t>{</w:t>
-            </w:r>
-            <w:proofErr w:type="spellStart"/>
-            <w:r>
-              <w:rPr>
-                <w:rFonts w:ascii="Arial" w:hAnsi="Arial" w:cs="Arial"/>
-                <w:sz w:val="20"/>
-                <w:szCs w:val="20"/>
-              </w:rPr>
-              <w:t>inspectorInitials</w:t>
-            </w:r>
-            <w:proofErr w:type="spellEnd"/>
-            <w:r>
-              <w:rPr>
-                <w:rFonts w:ascii="Arial" w:hAnsi="Arial" w:cs="Arial"/>
-                <w:sz w:val="20"/>
-                <w:szCs w:val="20"/>
-              </w:rPr>
-              <w:t>}</w:t>
+              <w:t>{inspectorInitials}</w:t>
             </w:r>
           </w:p>
         </w:tc>
@@ -428,25 +392,7 @@
                 <w:sz w:val="20"/>
                 <w:szCs w:val="20"/>
               </w:rPr>
-              <w:t>{</w:t>
-            </w:r>
-            <w:proofErr w:type="spellStart"/>
-            <w:r>
-              <w:rPr>
-                <w:rFonts w:ascii="Arial" w:hAnsi="Arial" w:cs="Arial"/>
-                <w:sz w:val="20"/>
-                <w:szCs w:val="20"/>
-              </w:rPr>
-              <w:t>clientPhone</w:t>
-            </w:r>
-            <w:proofErr w:type="spellEnd"/>
-            <w:r>
-              <w:rPr>
-                <w:rFonts w:ascii="Arial" w:hAnsi="Arial" w:cs="Arial"/>
-                <w:sz w:val="20"/>
-                <w:szCs w:val="20"/>
-              </w:rPr>
-              <w:t>}</w:t>
+              <w:t>{clientPhone}</w:t>
             </w:r>
           </w:p>
         </w:tc>
@@ -500,25 +446,7 @@
                 <w:sz w:val="20"/>
                 <w:szCs w:val="20"/>
               </w:rPr>
-              <w:t>{</w:t>
-            </w:r>
-            <w:proofErr w:type="spellStart"/>
-            <w:r>
-              <w:rPr>
-                <w:rFonts w:ascii="Arial" w:hAnsi="Arial" w:cs="Arial"/>
-                <w:sz w:val="20"/>
-                <w:szCs w:val="20"/>
-              </w:rPr>
-              <w:t>clientFax</w:t>
-            </w:r>
-            <w:proofErr w:type="spellEnd"/>
-            <w:r>
-              <w:rPr>
-                <w:rFonts w:ascii="Arial" w:hAnsi="Arial" w:cs="Arial"/>
-                <w:sz w:val="20"/>
-                <w:szCs w:val="20"/>
-              </w:rPr>
-              <w:t>}</w:t>
+              <w:t>{clientFax}</w:t>
             </w:r>
           </w:p>
         </w:tc>
@@ -579,25 +507,7 @@
                 <w:sz w:val="20"/>
                 <w:szCs w:val="20"/>
               </w:rPr>
-              <w:t>{</w:t>
-            </w:r>
-            <w:proofErr w:type="spellStart"/>
-            <w:r>
-              <w:rPr>
-                <w:rFonts w:ascii="Arial" w:hAnsi="Arial" w:cs="Arial"/>
-                <w:sz w:val="20"/>
-                <w:szCs w:val="20"/>
-              </w:rPr>
-              <w:t>projectSite</w:t>
-            </w:r>
-            <w:proofErr w:type="spellEnd"/>
-            <w:r>
-              <w:rPr>
-                <w:rFonts w:ascii="Arial" w:hAnsi="Arial" w:cs="Arial"/>
-                <w:sz w:val="20"/>
-                <w:szCs w:val="20"/>
-              </w:rPr>
-              <w:t>}</w:t>
+              <w:t>{projectSite}</w:t>
             </w:r>
           </w:p>
         </w:tc>
@@ -652,25 +562,7 @@
                 <w:sz w:val="20"/>
                 <w:szCs w:val="20"/>
               </w:rPr>
-              <w:t>{</w:t>
-            </w:r>
-            <w:proofErr w:type="spellStart"/>
-            <w:r>
-              <w:rPr>
-                <w:rFonts w:ascii="Arial" w:hAnsi="Arial" w:cs="Arial"/>
-                <w:sz w:val="20"/>
-                <w:szCs w:val="20"/>
-              </w:rPr>
-              <w:t>workLocation</w:t>
-            </w:r>
-            <w:proofErr w:type="spellEnd"/>
-            <w:r>
-              <w:rPr>
-                <w:rFonts w:ascii="Arial" w:hAnsi="Arial" w:cs="Arial"/>
-                <w:sz w:val="20"/>
-                <w:szCs w:val="20"/>
-              </w:rPr>
-              <w:t>}</w:t>
+              <w:t>{workLocation}</w:t>
             </w:r>
           </w:p>
         </w:tc>
@@ -816,25 +708,7 @@
                 <w:sz w:val="20"/>
                 <w:szCs w:val="20"/>
               </w:rPr>
-              <w:t>{</w:t>
-            </w:r>
-            <w:proofErr w:type="spellStart"/>
-            <w:r>
-              <w:rPr>
-                <w:rFonts w:ascii="Arial" w:hAnsi="Arial" w:cs="Arial"/>
-                <w:sz w:val="20"/>
-                <w:szCs w:val="20"/>
-              </w:rPr>
-              <w:t>personnelCount</w:t>
-            </w:r>
-            <w:proofErr w:type="spellEnd"/>
-            <w:r>
-              <w:rPr>
-                <w:rFonts w:ascii="Arial" w:hAnsi="Arial" w:cs="Arial"/>
-                <w:sz w:val="20"/>
-                <w:szCs w:val="20"/>
-              </w:rPr>
-              <w:t>}</w:t>
+              <w:t>{personnelCount}</w:t>
             </w:r>
           </w:p>
         </w:tc>
@@ -895,25 +769,7 @@
                 <w:sz w:val="20"/>
                 <w:szCs w:val="20"/>
               </w:rPr>
-              <w:t>{</w:t>
-            </w:r>
-            <w:proofErr w:type="spellStart"/>
-            <w:r>
-              <w:rPr>
-                <w:rFonts w:ascii="Arial" w:hAnsi="Arial" w:cs="Arial"/>
-                <w:sz w:val="20"/>
-                <w:szCs w:val="20"/>
-              </w:rPr>
-              <w:t>contractorPhone</w:t>
-            </w:r>
-            <w:proofErr w:type="spellEnd"/>
-            <w:r>
-              <w:rPr>
-                <w:rFonts w:ascii="Arial" w:hAnsi="Arial" w:cs="Arial"/>
-                <w:sz w:val="20"/>
-                <w:szCs w:val="20"/>
-              </w:rPr>
-              <w:t>}</w:t>
+              <w:t>{contractorPhone}</w:t>
             </w:r>
           </w:p>
         </w:tc>
@@ -967,25 +823,7 @@
                 <w:sz w:val="20"/>
                 <w:szCs w:val="20"/>
               </w:rPr>
-              <w:t>{</w:t>
-            </w:r>
-            <w:proofErr w:type="spellStart"/>
-            <w:r>
-              <w:rPr>
-                <w:rFonts w:ascii="Arial" w:hAnsi="Arial" w:cs="Arial"/>
-                <w:sz w:val="20"/>
-                <w:szCs w:val="20"/>
-              </w:rPr>
-              <w:t>contractorFax</w:t>
-            </w:r>
-            <w:proofErr w:type="spellEnd"/>
-            <w:r>
-              <w:rPr>
-                <w:rFonts w:ascii="Arial" w:hAnsi="Arial" w:cs="Arial"/>
-                <w:sz w:val="20"/>
-                <w:szCs w:val="20"/>
-              </w:rPr>
-              <w:t>}</w:t>
+              <w:t>{contractorFax}</w:t>
             </w:r>
           </w:p>
         </w:tc>
@@ -1286,67 +1124,31 @@
                 <w:sz w:val="18"/>
                 <w:szCs w:val="18"/>
               </w:rPr>
-              <w:t>{</w:t>
-            </w:r>
-            <w:proofErr w:type="spellStart"/>
-            <w:r>
+              <w:t>{sampleDescription}</w:t>
+            </w:r>
+          </w:p>
+        </w:tc>
+        <w:tc>
+          <w:tcPr>
+            <w:tcW w:w="1530" w:type="dxa"/>
+            <w:vAlign w:val="center"/>
+          </w:tcPr>
+          <w:p>
+            <w:pPr>
+              <w:jc w:val="center"/>
               <w:rPr>
                 <w:rFonts w:ascii="Arial" w:hAnsi="Arial" w:cs="Arial"/>
                 <w:sz w:val="18"/>
                 <w:szCs w:val="18"/>
               </w:rPr>
-              <w:t>sampleDescription</w:t>
-            </w:r>
-            <w:proofErr w:type="spellEnd"/>
+            </w:pPr>
             <w:r>
               <w:rPr>
                 <w:rFonts w:ascii="Arial" w:hAnsi="Arial" w:cs="Arial"/>
                 <w:sz w:val="18"/>
                 <w:szCs w:val="18"/>
               </w:rPr>
-              <w:t>}</w:t>
-            </w:r>
-          </w:p>
-        </w:tc>
-        <w:tc>
-          <w:tcPr>
-            <w:tcW w:w="1530" w:type="dxa"/>
-            <w:vAlign w:val="center"/>
-          </w:tcPr>
-          <w:p>
-            <w:pPr>
-              <w:jc w:val="center"/>
-              <w:rPr>
-                <w:rFonts w:ascii="Arial" w:hAnsi="Arial" w:cs="Arial"/>
-                <w:sz w:val="18"/>
-                <w:szCs w:val="18"/>
-              </w:rPr>
-            </w:pPr>
-            <w:r>
-              <w:rPr>
-                <w:rFonts w:ascii="Arial" w:hAnsi="Arial" w:cs="Arial"/>
-                <w:sz w:val="18"/>
-                <w:szCs w:val="18"/>
-              </w:rPr>
-              <w:t>{</w:t>
-            </w:r>
-            <w:proofErr w:type="spellStart"/>
-            <w:r>
-              <w:rPr>
-                <w:rFonts w:ascii="Arial" w:hAnsi="Arial" w:cs="Arial"/>
-                <w:sz w:val="18"/>
-                <w:szCs w:val="18"/>
-              </w:rPr>
-              <w:t>sampleType</w:t>
-            </w:r>
-            <w:proofErr w:type="spellEnd"/>
-            <w:r>
-              <w:rPr>
-                <w:rFonts w:ascii="Arial" w:hAnsi="Arial" w:cs="Arial"/>
-                <w:sz w:val="18"/>
-                <w:szCs w:val="18"/>
-              </w:rPr>
-              <w:t>}</w:t>
+              <w:t>{sampleType}</w:t>
             </w:r>
           </w:p>
         </w:tc>
@@ -1557,31 +1359,7 @@
                 <w:sz w:val="20"/>
                 <w:szCs w:val="20"/>
               </w:rPr>
-              <w:t>{#</w:t>
-            </w:r>
-            <w:r>
-              <w:rPr>
-                <w:rFonts w:ascii="Arial" w:hAnsi="Arial" w:cs="Arial"/>
-                <w:sz w:val="20"/>
-                <w:szCs w:val="20"/>
-              </w:rPr>
-              <w:t>log</w:t>
-            </w:r>
-            <w:r>
-              <w:rPr>
-                <w:rFonts w:ascii="Arial" w:hAnsi="Arial" w:cs="Arial"/>
-                <w:sz w:val="20"/>
-                <w:szCs w:val="20"/>
-              </w:rPr>
-              <w:t>E</w:t>
-            </w:r>
-            <w:r>
-              <w:rPr>
-                <w:rFonts w:ascii="Arial" w:hAnsi="Arial" w:cs="Arial"/>
-                <w:sz w:val="20"/>
-                <w:szCs w:val="20"/>
-              </w:rPr>
-              <w:t>ntries}{time}</w:t>
+              <w:t>{#logEntries}{time}</w:t>
             </w:r>
           </w:p>
         </w:tc>
@@ -1613,67 +1391,6 @@
               <w:t>{description}</w:t>
             </w:r>
           </w:p>
-          <w:p>
-            <w:pPr>
-              <w:rPr>
-                <w:rFonts w:ascii="Arial" w:hAnsi="Arial" w:cs="Arial"/>
-                <w:sz w:val="20"/>
-                <w:szCs w:val="20"/>
-              </w:rPr>
-            </w:pPr>
-            <w:r>
-              <w:rPr>
-                <w:rFonts w:ascii="Arial" w:hAnsi="Arial" w:cs="Arial"/>
-                <w:sz w:val="20"/>
-                <w:szCs w:val="20"/>
-              </w:rPr>
-              <w:t>{</w:t>
-            </w:r>
-            <w:proofErr w:type="spellStart"/>
-            <w:r>
-              <w:rPr>
-                <w:rFonts w:ascii="Arial" w:hAnsi="Arial" w:cs="Arial"/>
-                <w:sz w:val="20"/>
-                <w:szCs w:val="20"/>
-              </w:rPr>
-              <w:t>negativePressure</w:t>
-            </w:r>
-            <w:proofErr w:type="spellEnd"/>
-            <w:r>
-              <w:rPr>
-                <w:rFonts w:ascii="Arial" w:hAnsi="Arial" w:cs="Arial"/>
-                <w:sz w:val="20"/>
-                <w:szCs w:val="20"/>
-              </w:rPr>
-              <w:t>}</w:t>
-            </w:r>
-            <w:r>
-              <w:rPr>
-                <w:rFonts w:ascii="Arial" w:hAnsi="Arial" w:cs="Arial"/>
-                <w:sz w:val="20"/>
-                <w:szCs w:val="20"/>
-              </w:rPr>
-              <w:t>{/</w:t>
-            </w:r>
-            <w:proofErr w:type="spellStart"/>
-            <w:r>
-              <w:rPr>
-                <w:rFonts w:ascii="Arial" w:hAnsi="Arial" w:cs="Arial"/>
-                <w:sz w:val="20"/>
-                <w:szCs w:val="20"/>
-              </w:rPr>
-              <w:t>logEntries</w:t>
-            </w:r>
-            <w:proofErr w:type="spellEnd"/>
-            <w:r>
-              <w:rPr>
-                <w:rFonts w:ascii="Arial" w:hAnsi="Arial" w:cs="Arial"/>
-                <w:sz w:val="20"/>
-                <w:szCs w:val="20"/>
-              </w:rPr>
-              <w:t>}</w:t>
-            </w:r>
-          </w:p>
         </w:tc>
         <w:tc>
           <w:tcPr>
@@ -1700,30 +1417,37 @@
                 <w:sz w:val="20"/>
                 <w:szCs w:val="20"/>
               </w:rPr>
-              <w:t>{</w:t>
-            </w:r>
-            <w:proofErr w:type="spellStart"/>
-            <w:r>
-              <w:rPr>
-                <w:rFonts w:ascii="Arial" w:hAnsi="Arial" w:cs="Arial"/>
-                <w:sz w:val="20"/>
-                <w:szCs w:val="20"/>
-              </w:rPr>
-              <w:t>photoNumber</w:t>
-            </w:r>
-            <w:proofErr w:type="spellEnd"/>
-            <w:r>
-              <w:rPr>
-                <w:rFonts w:ascii="Arial" w:hAnsi="Arial" w:cs="Arial"/>
-                <w:sz w:val="20"/>
-                <w:szCs w:val="20"/>
-              </w:rPr>
-              <w:t>}</w:t>
+              <w:t>{photoNumber}</w:t>
+            </w:r>
+            <w:r>
+              <w:rPr>
+                <w:rFonts w:ascii="Arial" w:hAnsi="Arial" w:cs="Arial"/>
+                <w:sz w:val="20"/>
+                <w:szCs w:val="20"/>
+              </w:rPr>
+              <w:t>{/logEntries}</w:t>
             </w:r>
           </w:p>
         </w:tc>
       </w:tr>
     </w:tbl>
+    <w:p>
+      <w:pPr>
+        <w:rPr>
+          <w:rFonts w:ascii="Arial" w:hAnsi="Arial" w:cs="Arial"/>
+          <w:sz w:val="20"/>
+          <w:szCs w:val="20"/>
+        </w:rPr>
+      </w:pPr>
+      <w:r>
+        <w:rPr>
+          <w:rFonts w:ascii="Arial" w:hAnsi="Arial" w:cs="Arial"/>
+          <w:sz w:val="20"/>
+          <w:szCs w:val="20"/>
+        </w:rPr>
+        <w:t>{negativePressure}</w:t>
+      </w:r>
+    </w:p>
     <w:p>
       <w:pPr>
         <w:jc w:val="center"/>
@@ -1810,25 +1534,7 @@
                 <w:sz w:val="20"/>
                 <w:szCs w:val="20"/>
               </w:rPr>
-              <w:t>{</w:t>
-            </w:r>
-            <w:proofErr w:type="spellStart"/>
-            <w:r>
-              <w:rPr>
-                <w:rFonts w:ascii="Arial" w:hAnsi="Arial" w:cs="Arial"/>
-                <w:sz w:val="20"/>
-                <w:szCs w:val="20"/>
-              </w:rPr>
-              <w:t>inspectorName</w:t>
-            </w:r>
-            <w:proofErr w:type="spellEnd"/>
-            <w:r>
-              <w:rPr>
-                <w:rFonts w:ascii="Arial" w:hAnsi="Arial" w:cs="Arial"/>
-                <w:sz w:val="20"/>
-                <w:szCs w:val="20"/>
-              </w:rPr>
-              <w:t>}</w:t>
+              <w:t>{inspectorName}</w:t>
             </w:r>
           </w:p>
         </w:tc>
@@ -2096,82 +1802,7 @@
                 <w:sz w:val="20"/>
                 <w:szCs w:val="20"/>
               </w:rPr>
-              <w:t>{/col2}</w:t>
-            </w:r>
-          </w:p>
-        </w:tc>
-      </w:tr>
-      <w:tr>
-        <w:trPr>
-          <w:cantSplit/>
-          <w:trHeight w:val="125"/>
-        </w:trPr>
-        <w:tc>
-          <w:tcPr>
-            <w:tcW w:w="5040" w:type="dxa"/>
-            <w:tcBorders>
-              <w:top w:val="nil"/>
-              <w:left w:val="nil"/>
-              <w:bottom w:val="nil"/>
-              <w:right w:val="nil"/>
-            </w:tcBorders>
-            <w:vAlign w:val="center"/>
-          </w:tcPr>
-          <w:p>
-            <w:pPr>
-              <w:jc w:val="center"/>
-              <w:rPr>
-                <w:rFonts w:ascii="Arial" w:hAnsi="Arial" w:cs="Arial"/>
-                <w:sz w:val="20"/>
-                <w:szCs w:val="20"/>
-              </w:rPr>
-            </w:pPr>
-          </w:p>
-        </w:tc>
-        <w:tc>
-          <w:tcPr>
-            <w:tcW w:w="5040" w:type="dxa"/>
-            <w:tcBorders>
-              <w:top w:val="nil"/>
-              <w:left w:val="nil"/>
-              <w:bottom w:val="nil"/>
-              <w:right w:val="nil"/>
-            </w:tcBorders>
-          </w:tcPr>
-          <w:p>
-            <w:pPr>
-              <w:jc w:val="center"/>
-              <w:rPr>
-                <w:rFonts w:ascii="Arial" w:hAnsi="Arial" w:cs="Arial"/>
-                <w:sz w:val="20"/>
-                <w:szCs w:val="20"/>
-              </w:rPr>
-            </w:pPr>
-            <w:r>
-              <w:rPr>
-                <w:rFonts w:ascii="Arial" w:hAnsi="Arial" w:cs="Arial"/>
-                <w:sz w:val="20"/>
-                <w:szCs w:val="20"/>
-              </w:rPr>
-              <w:t>{/</w:t>
-            </w:r>
-            <w:proofErr w:type="spellStart"/>
-            <w:r>
-              <w:rPr>
-                <w:rFonts w:ascii="Arial" w:hAnsi="Arial" w:cs="Arial"/>
-                <w:sz w:val="20"/>
-                <w:szCs w:val="20"/>
-              </w:rPr>
-              <w:t>photoLogRows</w:t>
-            </w:r>
-            <w:proofErr w:type="spellEnd"/>
-            <w:r>
-              <w:rPr>
-                <w:rFonts w:ascii="Arial" w:hAnsi="Arial" w:cs="Arial"/>
-                <w:sz w:val="20"/>
-                <w:szCs w:val="20"/>
-              </w:rPr>
-              <w:t>}</w:t>
+              <w:t>{/col2}{/photoLogRows}</w:t>
             </w:r>
           </w:p>
         </w:tc>

</xml_diff>